<commit_message>
Pushing journal to save progress
</commit_message>
<xml_diff>
--- a/Journal.docx
+++ b/Journal.docx
@@ -899,15 +899,7 @@
         </w:numPr>
       </w:pPr>
       <w:r>
-        <w:t xml:space="preserve">When I try to use pip and install the packages, it keeps </w:t>
-      </w:r>
-      <w:proofErr w:type="gramStart"/>
-      <w:r>
-        <w:t>installing to</w:t>
-      </w:r>
-      <w:proofErr w:type="gramEnd"/>
-      <w:r>
-        <w:t xml:space="preserve"> Python 3.10 and says that the package is already there.</w:t>
+        <w:t>When I try to use pip and install the packages, it keeps installing to Python 3.10 and says that the package is already there.</w:t>
       </w:r>
     </w:p>
     <w:p>
@@ -1129,15 +1121,7 @@
       </w:r>
       <w:proofErr w:type="spellEnd"/>
       <w:r>
-        <w:t xml:space="preserve"> due to CORS policy -&gt; It was a hard fix because I thought I </w:t>
-      </w:r>
-      <w:proofErr w:type="gramStart"/>
-      <w:r>
-        <w:t>have</w:t>
-      </w:r>
-      <w:proofErr w:type="gramEnd"/>
-      <w:r>
-        <w:t xml:space="preserve"> already solved it before</w:t>
+        <w:t xml:space="preserve"> due to CORS policy -&gt; It was a hard fix because I thought I have already solved it before</w:t>
       </w:r>
       <w:r>
         <w:t xml:space="preserve">. I learned that </w:t>
@@ -1648,15 +1632,7 @@
       </w:r>
       <w:proofErr w:type="spellEnd"/>
       <w:r>
-        <w:t xml:space="preserve"> packages in the wrong place. I simply had to delete the incorrect installation and </w:t>
-      </w:r>
-      <w:proofErr w:type="gramStart"/>
-      <w:r>
-        <w:t>install</w:t>
-      </w:r>
-      <w:proofErr w:type="gramEnd"/>
-      <w:r>
-        <w:t xml:space="preserve"> into the right place.</w:t>
+        <w:t xml:space="preserve"> packages in the wrong place. I simply had to delete the incorrect installation and install into the right place.</w:t>
       </w:r>
     </w:p>
     <w:p>
@@ -1736,15 +1712,7 @@
         </w:numPr>
       </w:pPr>
       <w:r>
-        <w:t xml:space="preserve">There </w:t>
-      </w:r>
-      <w:proofErr w:type="gramStart"/>
-      <w:r>
-        <w:t>was</w:t>
-      </w:r>
-      <w:proofErr w:type="gramEnd"/>
-      <w:r>
-        <w:t xml:space="preserve"> a lot of asking </w:t>
+        <w:t xml:space="preserve">There was a lot of asking </w:t>
       </w:r>
       <w:proofErr w:type="spellStart"/>
       <w:r>
@@ -2718,15 +2686,7 @@
       </w:r>
       <w:proofErr w:type="spellEnd"/>
       <w:r>
-        <w:t xml:space="preserve"> should emit a signal to let the Frontend </w:t>
-      </w:r>
-      <w:proofErr w:type="gramStart"/>
-      <w:r>
-        <w:t>knows</w:t>
-      </w:r>
-      <w:proofErr w:type="gramEnd"/>
-      <w:r>
-        <w:t xml:space="preserve"> this job is done. Frontend should then find that job to report accuracy and update the table.</w:t>
+        <w:t xml:space="preserve"> should emit a signal to let the Frontend knows this job is done. Frontend should then find that job to report accuracy and update the table.</w:t>
       </w:r>
     </w:p>
     <w:p>
@@ -2932,8 +2892,128 @@
       </w:r>
     </w:p>
     <w:p>
-      <w:pPr>
-        <w:ind w:left="360"/>
+      <w:r>
+        <w:t>3/16/2024</w:t>
+      </w:r>
+    </w:p>
+    <w:p>
+      <w:pPr>
+        <w:pStyle w:val="ListParagraph"/>
+        <w:numPr>
+          <w:ilvl w:val="0"/>
+          <w:numId w:val="1"/>
+        </w:numPr>
+      </w:pPr>
+      <w:r>
+        <w:t>Learning how to deploy the app on the web. Some keywords I’m looking into are “containerization” and “</w:t>
+      </w:r>
+      <w:proofErr w:type="gramStart"/>
+      <w:r>
+        <w:t>Docker</w:t>
+      </w:r>
+      <w:proofErr w:type="gramEnd"/>
+      <w:r>
+        <w:t>”</w:t>
+      </w:r>
+    </w:p>
+    <w:p>
+      <w:pPr>
+        <w:pStyle w:val="ListParagraph"/>
+        <w:numPr>
+          <w:ilvl w:val="0"/>
+          <w:numId w:val="1"/>
+        </w:numPr>
+      </w:pPr>
+      <w:r>
+        <w:t xml:space="preserve">Followed this guide to containerize the Frontend: </w:t>
+      </w:r>
+      <w:hyperlink r:id="rId8" w:history="1">
+        <w:r>
+          <w:rPr>
+            <w:rStyle w:val="Hyperlink"/>
+          </w:rPr>
+          <w:t xml:space="preserve">How to </w:t>
+        </w:r>
+        <w:proofErr w:type="spellStart"/>
+        <w:r>
+          <w:rPr>
+            <w:rStyle w:val="Hyperlink"/>
+          </w:rPr>
+          <w:t>Dockerize</w:t>
+        </w:r>
+        <w:proofErr w:type="spellEnd"/>
+        <w:r>
+          <w:rPr>
+            <w:rStyle w:val="Hyperlink"/>
+          </w:rPr>
+          <w:t xml:space="preserve"> a React Application – A Step by Step Tutorial (freecodecamp.org)</w:t>
+        </w:r>
+      </w:hyperlink>
+    </w:p>
+    <w:p>
+      <w:pPr>
+        <w:pStyle w:val="ListParagraph"/>
+        <w:numPr>
+          <w:ilvl w:val="0"/>
+          <w:numId w:val="1"/>
+        </w:numPr>
+      </w:pPr>
+      <w:r>
+        <w:t xml:space="preserve">Trying to containerize the Backend. Learned that I will need a requirements.txt file, as it is a </w:t>
+      </w:r>
+      <w:r>
+        <w:rPr>
+          <w:b/>
+          <w:bCs/>
+        </w:rPr>
+        <w:t>standard Python mechanism for managing a project’s dependencies</w:t>
+      </w:r>
+      <w:r>
+        <w:t xml:space="preserve">, and Docker needs this file (Just like </w:t>
+      </w:r>
+      <w:proofErr w:type="spellStart"/>
+      <w:proofErr w:type="gramStart"/>
+      <w:r>
+        <w:t>package.json</w:t>
+      </w:r>
+      <w:proofErr w:type="spellEnd"/>
+      <w:proofErr w:type="gramEnd"/>
+      <w:r>
+        <w:t xml:space="preserve"> for React)</w:t>
+      </w:r>
+    </w:p>
+    <w:p>
+      <w:pPr>
+        <w:pStyle w:val="ListParagraph"/>
+        <w:numPr>
+          <w:ilvl w:val="0"/>
+          <w:numId w:val="1"/>
+        </w:numPr>
+      </w:pPr>
+      <w:r>
+        <w:t xml:space="preserve">Figuring out how to create a requirements.txt file </w:t>
+      </w:r>
+      <w:r>
+        <w:sym w:font="Wingdings" w:char="F0E0"/>
+      </w:r>
+      <w:r>
+        <w:t xml:space="preserve"> Trying </w:t>
+      </w:r>
+      <w:r>
+        <w:rPr>
+          <w:b/>
+          <w:bCs/>
+        </w:rPr>
+        <w:t>pip freeze &gt; requirements.txt</w:t>
+      </w:r>
+    </w:p>
+    <w:p>
+      <w:pPr>
+        <w:pStyle w:val="ListParagraph"/>
+        <w:numPr>
+          <w:ilvl w:val="0"/>
+          <w:numId w:val="1"/>
+        </w:numPr>
       </w:pPr>
     </w:p>
     <w:sectPr>

</xml_diff>